<commit_message>
refactor: keep relevance independent of difficulty evidence
</commit_message>
<xml_diff>
--- a/docs/edcraft logs.docx
+++ b/docs/edcraft logs.docx
@@ -12213,6 +12213,448 @@
           <w:t>Issue 44 relevance and question quality</w:t>
         </w:r>
       </w:hyperlink>
+    </w:p>
+    <w:p>
+      <w:pPr>
+        <w:pStyle w:val="EdCraftSimpleHeading"/>
+        <w:keepNext/>
+        <w:pageBreakBefore/>
+        <w:spacing w:after="120" w:line="252" w:lineRule="auto"/>
+      </w:pPr>
+      <w:r>
+        <w:rPr>
+          <w:rFonts w:ascii="Arial" w:hAnsi="Arial"/>
+          <w:b/>
+          <w:color w:val="000000"/>
+          <w:sz w:val="30"/>
+        </w:rPr>
+        <w:t>Independent relevance and difficulty checks</w:t>
+      </w:r>
+    </w:p>
+    <w:p>
+      <w:pPr>
+        <w:pStyle w:val="EdCraftSimpleBody"/>
+        <w:spacing w:after="120" w:line="252" w:lineRule="auto"/>
+      </w:pPr>
+      <w:r>
+        <w:rPr>
+          <w:rFonts w:ascii="Arial" w:hAnsi="Arial"/>
+          <w:b w:val="0"/>
+          <w:color w:val="000000"/>
+          <w:sz w:val="22"/>
+        </w:rPr>
+        <w:t>21 October 2026. Relevance and difficulty assessments now accept their own inputs and return their own evidence. This decision supersedes the difficulty evidence reuse described on pages 19 and 21.</w:t>
+      </w:r>
+    </w:p>
+    <w:tbl>
+      <w:tblPr>
+        <w:tblW w:type="auto" w:w="0"/>
+        <w:tblLayout w:type="fixed"/>
+        <w:tblLook w:firstColumn="1" w:firstRow="1" w:lastColumn="0" w:lastRow="0" w:noHBand="0" w:noVBand="1" w:val="04A0"/>
+        <w:jc w:val="center"/>
+        <w:tblBorders>
+          <w:top w:val="single" w:sz="4" w:color="D9D9D9"/>
+          <w:left w:val="single" w:sz="4" w:color="D9D9D9"/>
+          <w:bottom w:val="single" w:sz="4" w:color="D9D9D9"/>
+          <w:right w:val="single" w:sz="4" w:color="D9D9D9"/>
+          <w:insideH w:val="single" w:sz="4" w:color="D9D9D9"/>
+          <w:insideV w:val="single" w:sz="4" w:color="D9D9D9"/>
+        </w:tblBorders>
+        <w:tblCellMar>
+          <w:top w:w="90" w:type="dxa"/>
+          <w:left w:w="90" w:type="dxa"/>
+          <w:bottom w:w="90" w:type="dxa"/>
+          <w:right w:w="90" w:type="dxa"/>
+        </w:tblCellMar>
+      </w:tblPr>
+      <w:tblGrid>
+        <w:gridCol w:w="1800"/>
+        <w:gridCol w:w="3816"/>
+        <w:gridCol w:w="4608"/>
+      </w:tblGrid>
+      <w:tr>
+        <w:trPr>
+          <w:cantSplit/>
+          <w:tblHeader/>
+        </w:trPr>
+        <w:tc>
+          <w:tcPr>
+            <w:tcW w:type="dxa" w:w="1800"/>
+            <w:vAlign w:val="center"/>
+            <w:shd w:fill="E7E6E6"/>
+          </w:tcPr>
+          <w:p>
+            <w:pPr>
+              <w:pStyle w:val="EdCraftSimpleBody"/>
+              <w:spacing w:after="0" w:before="0" w:line="252" w:lineRule="auto"/>
+            </w:pPr>
+            <w:r>
+              <w:rPr>
+                <w:rFonts w:ascii="Arial" w:hAnsi="Arial"/>
+                <w:b/>
+                <w:color w:val="000000"/>
+                <w:sz w:val="21"/>
+              </w:rPr>
+              <w:t>Check</w:t>
+            </w:r>
+          </w:p>
+        </w:tc>
+        <w:tc>
+          <w:tcPr>
+            <w:tcW w:type="dxa" w:w="3816"/>
+            <w:vAlign w:val="center"/>
+            <w:shd w:fill="E7E6E6"/>
+          </w:tcPr>
+          <w:p>
+            <w:pPr>
+              <w:pStyle w:val="EdCraftSimpleBody"/>
+              <w:spacing w:after="0" w:before="0" w:line="252" w:lineRule="auto"/>
+            </w:pPr>
+            <w:r>
+              <w:rPr>
+                <w:rFonts w:ascii="Arial" w:hAnsi="Arial"/>
+                <w:b/>
+                <w:color w:val="000000"/>
+                <w:sz w:val="21"/>
+              </w:rPr>
+              <w:t>Inputs</w:t>
+            </w:r>
+          </w:p>
+        </w:tc>
+        <w:tc>
+          <w:tcPr>
+            <w:tcW w:type="dxa" w:w="4608"/>
+            <w:vAlign w:val="center"/>
+            <w:shd w:fill="E7E6E6"/>
+          </w:tcPr>
+          <w:p>
+            <w:pPr>
+              <w:pStyle w:val="EdCraftSimpleBody"/>
+              <w:spacing w:after="0" w:before="0" w:line="252" w:lineRule="auto"/>
+            </w:pPr>
+            <w:r>
+              <w:rPr>
+                <w:rFonts w:ascii="Arial" w:hAnsi="Arial"/>
+                <w:b/>
+                <w:color w:val="000000"/>
+                <w:sz w:val="21"/>
+              </w:rPr>
+              <w:t>Own results</w:t>
+            </w:r>
+          </w:p>
+        </w:tc>
+      </w:tr>
+      <w:tr>
+        <w:trPr>
+          <w:cantSplit/>
+        </w:trPr>
+        <w:tc>
+          <w:tcPr>
+            <w:tcW w:type="dxa" w:w="1800"/>
+            <w:vAlign w:val="center"/>
+          </w:tcPr>
+          <w:p>
+            <w:pPr>
+              <w:pStyle w:val="EdCraftSimpleBody"/>
+              <w:spacing w:after="0" w:before="0" w:line="252" w:lineRule="auto"/>
+            </w:pPr>
+            <w:r>
+              <w:rPr>
+                <w:rFonts w:ascii="Arial" w:hAnsi="Arial"/>
+                <w:b w:val="0"/>
+                <w:color w:val="000000"/>
+                <w:sz w:val="21"/>
+              </w:rPr>
+              <w:t>Correctness</w:t>
+            </w:r>
+          </w:p>
+        </w:tc>
+        <w:tc>
+          <w:tcPr>
+            <w:tcW w:type="dxa" w:w="3816"/>
+            <w:vAlign w:val="center"/>
+          </w:tcPr>
+          <w:p>
+            <w:pPr>
+              <w:pStyle w:val="EdCraftSimpleBody"/>
+              <w:spacing w:after="0" w:before="0" w:line="252" w:lineRule="auto"/>
+            </w:pPr>
+            <w:r>
+              <w:rPr>
+                <w:rFonts w:ascii="Arial" w:hAnsi="Arial"/>
+                <w:b w:val="0"/>
+                <w:color w:val="000000"/>
+                <w:sz w:val="21"/>
+              </w:rPr>
+              <w:t>Code, exact inputs, answer target and options</w:t>
+            </w:r>
+          </w:p>
+        </w:tc>
+        <w:tc>
+          <w:tcPr>
+            <w:tcW w:type="dxa" w:w="4608"/>
+            <w:vAlign w:val="center"/>
+          </w:tcPr>
+          <w:p>
+            <w:pPr>
+              <w:pStyle w:val="EdCraftSimpleBody"/>
+              <w:spacing w:after="0" w:before="0" w:line="252" w:lineRule="auto"/>
+            </w:pPr>
+            <w:r>
+              <w:rPr>
+                <w:rFonts w:ascii="Arial" w:hAnsi="Arial"/>
+                <w:b w:val="0"/>
+                <w:color w:val="000000"/>
+                <w:sz w:val="21"/>
+              </w:rPr>
+              <w:t>Canonical answer, distinct wrong options and findings</w:t>
+            </w:r>
+          </w:p>
+        </w:tc>
+      </w:tr>
+      <w:tr>
+        <w:trPr>
+          <w:cantSplit/>
+        </w:trPr>
+        <w:tc>
+          <w:tcPr>
+            <w:tcW w:type="dxa" w:w="1800"/>
+            <w:vAlign w:val="center"/>
+          </w:tcPr>
+          <w:p>
+            <w:pPr>
+              <w:pStyle w:val="EdCraftSimpleBody"/>
+              <w:spacing w:after="0" w:before="0" w:line="252" w:lineRule="auto"/>
+            </w:pPr>
+            <w:r>
+              <w:rPr>
+                <w:rFonts w:ascii="Arial" w:hAnsi="Arial"/>
+                <w:b w:val="0"/>
+                <w:color w:val="000000"/>
+                <w:sz w:val="21"/>
+              </w:rPr>
+              <w:t>Relevance</w:t>
+            </w:r>
+          </w:p>
+        </w:tc>
+        <w:tc>
+          <w:tcPr>
+            <w:tcW w:type="dxa" w:w="3816"/>
+            <w:vAlign w:val="center"/>
+          </w:tcPr>
+          <w:p>
+            <w:pPr>
+              <w:pStyle w:val="EdCraftSimpleBody"/>
+              <w:spacing w:after="0" w:before="0" w:line="252" w:lineRule="auto"/>
+            </w:pPr>
+            <w:r>
+              <w:rPr>
+                <w:rFonts w:ascii="Arial" w:hAnsi="Arial"/>
+                <w:b w:val="0"/>
+                <w:color w:val="000000"/>
+                <w:sz w:val="21"/>
+              </w:rPr>
+              <w:t>Complete question and original author request</w:t>
+            </w:r>
+          </w:p>
+        </w:tc>
+        <w:tc>
+          <w:tcPr>
+            <w:tcW w:type="dxa" w:w="4608"/>
+            <w:vAlign w:val="center"/>
+          </w:tcPr>
+          <w:p>
+            <w:pPr>
+              <w:pStyle w:val="EdCraftSimpleBody"/>
+              <w:spacing w:after="0" w:before="0" w:line="252" w:lineRule="auto"/>
+            </w:pPr>
+            <w:r>
+              <w:rPr>
+                <w:rFonts w:ascii="Arial" w:hAnsi="Arial"/>
+                <w:b w:val="0"/>
+                <w:color w:val="000000"/>
+                <w:sz w:val="21"/>
+              </w:rPr>
+              <w:t>Embedding similarity and explicit requirement findings</w:t>
+            </w:r>
+          </w:p>
+        </w:tc>
+      </w:tr>
+      <w:tr>
+        <w:trPr>
+          <w:cantSplit/>
+        </w:trPr>
+        <w:tc>
+          <w:tcPr>
+            <w:tcW w:type="dxa" w:w="1800"/>
+            <w:vAlign w:val="center"/>
+          </w:tcPr>
+          <w:p>
+            <w:pPr>
+              <w:pStyle w:val="EdCraftSimpleBody"/>
+              <w:spacing w:after="0" w:before="0" w:line="252" w:lineRule="auto"/>
+            </w:pPr>
+            <w:r>
+              <w:rPr>
+                <w:rFonts w:ascii="Arial" w:hAnsi="Arial"/>
+                <w:b w:val="0"/>
+                <w:color w:val="000000"/>
+                <w:sz w:val="21"/>
+              </w:rPr>
+              <w:t>Difficulty</w:t>
+            </w:r>
+          </w:p>
+        </w:tc>
+        <w:tc>
+          <w:tcPr>
+            <w:tcW w:type="dxa" w:w="3816"/>
+            <w:vAlign w:val="center"/>
+          </w:tcPr>
+          <w:p>
+            <w:pPr>
+              <w:pStyle w:val="EdCraftSimpleBody"/>
+              <w:spacing w:after="0" w:before="0" w:line="252" w:lineRule="auto"/>
+            </w:pPr>
+            <w:r>
+              <w:rPr>
+                <w:rFonts w:ascii="Arial" w:hAnsi="Arial"/>
+                <w:b w:val="0"/>
+                <w:color w:val="000000"/>
+                <w:sz w:val="21"/>
+              </w:rPr>
+              <w:t>Complete question and optional requested level</w:t>
+            </w:r>
+          </w:p>
+        </w:tc>
+        <w:tc>
+          <w:tcPr>
+            <w:tcW w:type="dxa" w:w="4608"/>
+            <w:vAlign w:val="center"/>
+          </w:tcPr>
+          <w:p>
+            <w:pPr>
+              <w:pStyle w:val="EdCraftSimpleBody"/>
+              <w:spacing w:after="0" w:before="0" w:line="252" w:lineRule="auto"/>
+            </w:pPr>
+            <w:r>
+              <w:rPr>
+                <w:rFonts w:ascii="Arial" w:hAnsi="Arial"/>
+                <w:b w:val="0"/>
+                <w:color w:val="000000"/>
+                <w:sz w:val="21"/>
+              </w:rPr>
+              <w:t>Difficulty estimate, option reasoning and quality concerns</w:t>
+            </w:r>
+          </w:p>
+        </w:tc>
+      </w:tr>
+    </w:tbl>
+    <w:p>
+      <w:pPr>
+        <w:pStyle w:val="EdCraftSimpleSubheading"/>
+        <w:keepNext/>
+        <w:spacing w:after="120" w:line="252" w:lineRule="auto"/>
+      </w:pPr>
+      <w:r>
+        <w:rPr>
+          <w:rFonts w:ascii="Arial" w:hAnsi="Arial"/>
+          <w:b/>
+          <w:color w:val="000000"/>
+          <w:sz w:val="24"/>
+        </w:rPr>
+        <w:t>What changed</w:t>
+      </w:r>
+    </w:p>
+    <w:p>
+      <w:pPr>
+        <w:pStyle w:val="EdCraftSimpleBody"/>
+        <w:spacing w:after="120" w:line="252" w:lineRule="auto"/>
+      </w:pPr>
+      <w:r>
+        <w:rPr>
+          <w:rFonts w:ascii="Arial" w:hAnsi="Arial"/>
+          <w:b w:val="0"/>
+          <w:color w:val="000000"/>
+          <w:sz w:val="22"/>
+        </w:rPr>
+        <w:t>assess_code_quality version 3.0.0 no longer accepts difficulty_report or returns difficulty_quality. We removed the report loader, identity checks, option coverage checks and timestamp conversion code associated with reuse. The evaluator no longer accepts --difficulty-reports. Old report arguments are rejected before execution or embedding calls.</w:t>
+      </w:r>
+    </w:p>
+    <w:p>
+      <w:pPr>
+        <w:pStyle w:val="EdCraftSimpleBody"/>
+        <w:spacing w:after="120" w:line="252" w:lineRule="auto"/>
+      </w:pPr>
+      <w:r>
+        <w:rPr>
+          <w:rFonts w:ascii="Arial" w:hAnsi="Arial"/>
+          <w:b w:val="0"/>
+          <w:color w:val="000000"/>
+          <w:sz w:val="22"/>
+        </w:rPr>
+        <w:t>Previously, a stale difficulty report could stop the relevance assessment before its own checks ran. Removing that input removes the evidence and failure dependency. Shared question schemas and execution utilities remain reusable; checks do not consume another check’s judgment. A caller can display the separate reports together.</w:t>
+      </w:r>
+    </w:p>
+    <w:p>
+      <w:pPr>
+        <w:pStyle w:val="EdCraftSimpleSubheading"/>
+        <w:keepNext/>
+        <w:spacing w:after="120" w:line="252" w:lineRule="auto"/>
+      </w:pPr>
+      <w:r>
+        <w:rPr>
+          <w:rFonts w:ascii="Arial" w:hAnsi="Arial"/>
+          <w:b/>
+          <w:color w:val="000000"/>
+          <w:sz w:val="24"/>
+        </w:rPr>
+        <w:t>Calls and verification</w:t>
+      </w:r>
+    </w:p>
+    <w:p>
+      <w:pPr>
+        <w:pStyle w:val="EdCraftSimpleBody"/>
+        <w:spacing w:after="120" w:line="252" w:lineRule="auto"/>
+      </w:pPr>
+      <w:r>
+        <w:rPr>
+          <w:rFonts w:ascii="Arial" w:hAnsi="Arial"/>
+          <w:b w:val="0"/>
+          <w:color w:val="000000"/>
+          <w:sz w:val="22"/>
+        </w:rPr>
+        <w:t>Relevance makes one batched embedding request and no generative judge call. The difficulty judge retains its own quality concerns. Correctness and explicit requirements are computed locally; no additional LLM call was introduced.</w:t>
+      </w:r>
+    </w:p>
+    <w:p>
+      <w:pPr>
+        <w:pStyle w:val="EdCraftSimpleBody"/>
+        <w:spacing w:after="120" w:line="252" w:lineRule="auto"/>
+      </w:pPr>
+      <w:r>
+        <w:rPr>
+          <w:rFonts w:ascii="Arial" w:hAnsi="Arial"/>
+          <w:b w:val="0"/>
+          <w:color w:val="000000"/>
+          <w:sz w:val="22"/>
+        </w:rPr>
+        <w:t>The backend passed 590 tests, with two existing optional live tests skipped. Tests verify that relevance succeeds after either a successful or failed difficulty assessment, that schemas exclude difficulty evidence, and that old inputs are rejected before work starts. Lint, formatting, dependency lock and package build checks passed.</w:t>
+      </w:r>
+    </w:p>
+    <w:p>
+      <w:pPr>
+        <w:pStyle w:val="EdCraftSimpleBody"/>
+        <w:spacing w:after="120" w:line="252" w:lineRule="auto"/>
+      </w:pPr>
+      <w:r>
+        <w:rPr>
+          <w:rFonts w:ascii="Arial" w:hAnsi="Arial"/>
+          <w:b w:val="0"/>
+          <w:color w:val="000000"/>
+          <w:sz w:val="22"/>
+        </w:rPr>
+        <w:t>The evaluator also reserves all three output files before writing and returns a nonzero exit code for unexpected mandatory check failures. Expected negative controls remain valid. The frozen 12 questions, seven controls and original live records are unchanged. No live API evaluation was run for this refactor; the earlier model comparison remains provisional published benchmark evidence.</w:t>
+      </w:r>
     </w:p>
     <w:sectPr>
       <w:footerReference w:type="default" r:id="rId36"/>

</xml_diff>

<commit_message>
docs: record live relevance smoke test in project log
</commit_message>
<xml_diff>
--- a/docs/edcraft logs.docx
+++ b/docs/edcraft logs.docx
@@ -12653,7 +12653,71 @@
           <w:color w:val="000000"/>
           <w:sz w:val="22"/>
         </w:rPr>
-        <w:t>The evaluator also reserves all three output files before writing and returns a nonzero exit code for unexpected mandatory check failures. Expected negative controls remain valid. The frozen 12 questions, seven controls and original live records are unchanged. No live API evaluation was run for this refactor; the earlier model comparison remains provisional published benchmark evidence.</w:t>
+        <w:t>The evaluator also reserves all three output files before writing and returns a nonzero exit code for unexpected mandatory check failures. Expected negative controls remain valid. The frozen 12 questions, seven controls and original live records are unchanged. The refactor was initially verified offline. The later live smoke test is recorded below; model selection still rests on provisional published benchmark evidence.</w:t>
+      </w:r>
+    </w:p>
+    <w:p>
+      <w:pPr>
+        <w:pStyle w:val="EdCraftSimpleSubheading"/>
+        <w:keepNext/>
+        <w:spacing w:after="120" w:line="252" w:lineRule="auto"/>
+      </w:pPr>
+      <w:r>
+        <w:rPr>
+          <w:rFonts w:ascii="Arial" w:hAnsi="Arial"/>
+          <w:b/>
+          <w:color w:val="000000"/>
+          <w:sz w:val="24"/>
+        </w:rPr>
+        <w:t>Live relevance smoke test</w:t>
+      </w:r>
+    </w:p>
+    <w:p>
+      <w:pPr>
+        <w:pStyle w:val="EdCraftSimpleBody"/>
+        <w:keepNext w:val="0"/>
+        <w:spacing w:after="120" w:line="252" w:lineRule="auto"/>
+      </w:pPr>
+      <w:r>
+        <w:rPr>
+          <w:rFonts w:ascii="Arial" w:hAnsi="Arial"/>
+          <w:b w:val="0"/>
+          <w:color w:val="000000"/>
+          <w:sz w:val="22"/>
+        </w:rPr>
+        <w:t>21 October 2026. One live MCP call to assess_code_quality version 3.0.0 passed using text-embedding-3-large. The synthetic arithmetic control returned the correct canonical answer of 10 and satisfied its explicit requirements. OpenAI returned 3,072-dimensional vectors; the request used 224 input tokens. Embedding latency was 3.054 seconds and total assessment time was 3.165 seconds. There was one embedding request, no retries and no generative judge call or reused difficulty evidence.</w:t>
+      </w:r>
+    </w:p>
+    <w:p>
+      <w:pPr>
+        <w:pStyle w:val="EdCraftSimpleBody"/>
+        <w:keepNext w:val="0"/>
+        <w:spacing w:after="120" w:line="252" w:lineRule="auto"/>
+      </w:pPr>
+      <w:r>
+        <w:rPr>
+          <w:rFonts w:ascii="Arial" w:hAnsi="Arial"/>
+          <w:b w:val="0"/>
+          <w:color w:val="000000"/>
+          <w:sz w:val="22"/>
+        </w:rPr>
+        <w:t>Cosine similarity was 0.564683. Exact comparison text, omission of the answer designation and the score calculation were verified. This single case validates integration, not relevance accuracy, a model ranking or a pass threshold.</w:t>
+      </w:r>
+    </w:p>
+    <w:p>
+      <w:pPr>
+        <w:pStyle w:val="EdCraftSimpleBody"/>
+        <w:keepNext w:val="0"/>
+        <w:spacing w:after="120" w:line="252" w:lineRule="auto"/>
+      </w:pPr>
+      <w:r>
+        <w:rPr>
+          <w:rFonts w:ascii="Arial" w:hAnsi="Arial"/>
+          <w:b w:val="0"/>
+          <w:color w:val="000000"/>
+          <w:sz w:val="22"/>
+        </w:rPr>
+        <w:t>Local evidence: .artifacts/issue-44/live-relevance-v3-20261021T082612724539Z/verification.json</w:t>
       </w:r>
     </w:p>
     <w:sectPr>

</xml_diff>